<commit_message>
thông tin thay đổi
</commit_message>
<xml_diff>
--- a/Ket_Qua_Phan_Tich_SO SÁNH PP - ĐTCS/2. Tổng hợp KQ báo cáo.docx
+++ b/Ket_Qua_Phan_Tich_SO SÁNH PP - ĐTCS/2. Tổng hợp KQ báo cáo.docx
@@ -2,6 +2,45 @@
 <file path=word/document.xml><?xml version="1.0" encoding="utf-8"?>
 <w:document xmlns:wpc="http://schemas.microsoft.com/office/word/2010/wordprocessingCanvas" xmlns:cx="http://schemas.microsoft.com/office/drawing/2014/chartex" xmlns:mc="http://schemas.openxmlformats.org/markup-compatibility/2006" xmlns:o="urn:schemas-microsoft-com:office:office" xmlns:r="http://schemas.openxmlformats.org/officeDocument/2006/relationships" xmlns:m="http://schemas.openxmlformats.org/officeDocument/2006/math" xmlns:v="urn:schemas-microsoft-com:vml" xmlns:wp14="http://schemas.microsoft.com/office/word/2010/wordprocessingDrawing" xmlns:wp="http://schemas.openxmlformats.org/drawingml/2006/wordprocessingDrawing" xmlns:w10="urn:schemas-microsoft-com:office:word" xmlns:w="http://schemas.openxmlformats.org/wordprocessingml/2006/main" xmlns:w14="http://schemas.microsoft.com/office/word/2010/wordml" xmlns:w15="http://schemas.microsoft.com/office/word/2012/wordml" xmlns:w16se="http://schemas.microsoft.com/office/word/2015/wordml/symex" xmlns:wpg="http://schemas.microsoft.com/office/word/2010/wordprocessingGroup" xmlns:wpi="http://schemas.microsoft.com/office/word/2010/wordprocessingInk" xmlns:wne="http://schemas.microsoft.com/office/word/2006/wordml" xmlns:wps="http://schemas.microsoft.com/office/word/2010/wordprocessingShape" mc:Ignorable="w14 w15 w16se wp14">
   <w:body>
+    <w:p>
+      <w:pPr>
+        <w:rPr>
+          <w:b/>
+        </w:rPr>
+      </w:pPr>
+      <w:r>
+        <w:rPr>
+          <w:b/>
+        </w:rPr>
+        <w:t>I. PHƯƠNG PHÁP NGHIÊN CỨU</w:t>
+      </w:r>
+    </w:p>
+    <w:p>
+      <w:pPr>
+        <w:rPr>
+          <w:b/>
+        </w:rPr>
+      </w:pPr>
+    </w:p>
+    <w:p>
+      <w:pPr>
+        <w:rPr>
+          <w:b/>
+        </w:rPr>
+      </w:pPr>
+      <w:r>
+        <w:rPr>
+          <w:b/>
+        </w:rPr>
+        <w:t>I</w:t>
+      </w:r>
+      <w:r>
+        <w:rPr>
+          <w:b/>
+        </w:rPr>
+        <w:t>I. KẾT QUẢ</w:t>
+      </w:r>
+    </w:p>
     <w:p>
       <w:r>
         <w:t>1. Ảnh hưởng đến chỉ số huyết thanh</w:t>
@@ -187,6 +226,8 @@
               </w:rPr>
               <w:t xml:space="preserve"> (IQR) </w:t>
             </w:r>
+            <w:bookmarkStart w:id="0" w:name="_GoBack"/>
+            <w:bookmarkEnd w:id="0"/>
           </w:p>
           <w:p>
             <w:pPr>
@@ -274,8 +315,41 @@
                 <w:color w:val="000000"/>
                 <w:lang w:eastAsia="en-GB"/>
               </w:rPr>
-              <w:t>Độ lệch (Bias)</w:t>
-            </w:r>
+              <w:t xml:space="preserve">Độ lệch </w:t>
+            </w:r>
+            <w:r>
+              <w:rPr>
+                <w:rFonts w:ascii="Calibri" w:eastAsia="Times New Roman" w:hAnsi="Calibri" w:cs="Calibri"/>
+                <w:color w:val="000000"/>
+                <w:lang w:eastAsia="en-GB"/>
+              </w:rPr>
+              <w:t>PPB-PPA</w:t>
+            </w:r>
+            <w:r>
+              <w:rPr>
+                <w:rFonts w:ascii="Calibri" w:eastAsia="Times New Roman" w:hAnsi="Calibri" w:cs="Calibri"/>
+                <w:color w:val="000000"/>
+                <w:lang w:eastAsia="en-GB"/>
+              </w:rPr>
+              <w:t xml:space="preserve"> </w:t>
+            </w:r>
+            <w:r>
+              <w:rPr>
+                <w:rFonts w:ascii="Calibri" w:eastAsia="Times New Roman" w:hAnsi="Calibri" w:cs="Calibri"/>
+                <w:color w:val="000000"/>
+                <w:lang w:eastAsia="en-GB"/>
+              </w:rPr>
+              <w:t>(Bias)</w:t>
+            </w:r>
+          </w:p>
+          <w:p>
+            <w:pPr>
+              <w:rPr>
+                <w:rFonts w:ascii="Calibri" w:eastAsia="Times New Roman" w:hAnsi="Calibri" w:cs="Calibri"/>
+                <w:color w:val="000000"/>
+                <w:lang w:eastAsia="en-GB"/>
+              </w:rPr>
+            </w:pPr>
           </w:p>
         </w:tc>
         <w:tc>
@@ -458,7 +532,7 @@
                 <w:color w:val="000000"/>
                 <w:lang w:eastAsia="en-GB"/>
               </w:rPr>
-              <w:t>0.6535</w:t>
+              <w:t>0.653</w:t>
             </w:r>
           </w:p>
         </w:tc>
@@ -666,7 +740,7 @@
                 <w:color w:val="000000"/>
                 <w:lang w:eastAsia="en-GB"/>
               </w:rPr>
-              <w:t>0.6817</w:t>
+              <w:t>0.682</w:t>
             </w:r>
           </w:p>
         </w:tc>
@@ -874,7 +948,7 @@
                 <w:color w:val="000000"/>
                 <w:lang w:eastAsia="en-GB"/>
               </w:rPr>
-              <w:t>1.0000</w:t>
+              <w:t>1.000</w:t>
             </w:r>
           </w:p>
         </w:tc>
@@ -928,6 +1002,154 @@
         </w:tc>
       </w:tr>
     </w:tbl>
+    <w:p>
+      <w:pPr>
+        <w:rPr>
+          <w:rFonts w:ascii="Times New Roman" w:eastAsia="Times New Roman" w:hAnsi="Times New Roman" w:cs="Times New Roman"/>
+          <w:sz w:val="24"/>
+          <w:szCs w:val="24"/>
+          <w:lang w:eastAsia="en-GB"/>
+        </w:rPr>
+      </w:pPr>
+      <w:r>
+        <w:t xml:space="preserve">Nhận xét: </w:t>
+      </w:r>
+      <w:r>
+        <w:rPr>
+          <w:rFonts w:ascii="Times New Roman" w:eastAsia="Times New Roman" w:hAnsi="Times New Roman" w:cs="Times New Roman"/>
+          <w:sz w:val="24"/>
+          <w:szCs w:val="24"/>
+          <w:lang w:eastAsia="en-GB"/>
+        </w:rPr>
+        <w:t>Kết quả kiểm định Wilcoxon Signed-Rank (</w:t>
+      </w:r>
+      <w:r>
+        <w:rPr>
+          <w:rFonts w:ascii="Times New Roman" w:eastAsia="Times New Roman" w:hAnsi="Times New Roman" w:cs="Times New Roman"/>
+          <w:sz w:val="24"/>
+          <w:szCs w:val="24"/>
+          <w:lang w:eastAsia="en-GB"/>
+        </w:rPr>
+        <w:t>N = 40) cho thấy</w:t>
+      </w:r>
+      <w:r>
+        <w:rPr>
+          <w:rFonts w:ascii="Times New Roman" w:eastAsia="Times New Roman" w:hAnsi="Times New Roman" w:cs="Times New Roman"/>
+          <w:sz w:val="24"/>
+          <w:szCs w:val="24"/>
+          <w:lang w:eastAsia="en-GB"/>
+        </w:rPr>
+        <w:t xml:space="preserve"> sự tương đồng giữa Phươ</w:t>
+      </w:r>
+      <w:r>
+        <w:rPr>
+          <w:rFonts w:ascii="Times New Roman" w:eastAsia="Times New Roman" w:hAnsi="Times New Roman" w:cs="Times New Roman"/>
+          <w:sz w:val="24"/>
+          <w:szCs w:val="24"/>
+          <w:lang w:eastAsia="en-GB"/>
+        </w:rPr>
+        <w:t xml:space="preserve">ng pháp vận chuyển thủ công (PPA) và Phương pháp vận chuyển bằng khí nén </w:t>
+      </w:r>
+      <w:r>
+        <w:rPr>
+          <w:rFonts w:ascii="Times New Roman" w:eastAsia="Times New Roman" w:hAnsi="Times New Roman" w:cs="Times New Roman"/>
+          <w:sz w:val="24"/>
+          <w:szCs w:val="24"/>
+          <w:lang w:eastAsia="en-GB"/>
+        </w:rPr>
+        <w:t xml:space="preserve"> (PPB) đối với </w:t>
+      </w:r>
+      <w:r>
+        <w:rPr>
+          <w:rFonts w:ascii="Times New Roman" w:eastAsia="Times New Roman" w:hAnsi="Times New Roman" w:cs="Times New Roman"/>
+          <w:sz w:val="24"/>
+          <w:szCs w:val="24"/>
+          <w:lang w:eastAsia="en-GB"/>
+        </w:rPr>
+        <w:t>cả 3</w:t>
+      </w:r>
+      <w:r>
+        <w:rPr>
+          <w:rFonts w:ascii="Times New Roman" w:eastAsia="Times New Roman" w:hAnsi="Times New Roman" w:cs="Times New Roman"/>
+          <w:sz w:val="24"/>
+          <w:szCs w:val="24"/>
+          <w:lang w:eastAsia="en-GB"/>
+        </w:rPr>
+        <w:t xml:space="preserve"> chỉ số huyết thanh (H, L, I). Cụ thể, tất cả các chỉ số đều nhận giá trị </w:t>
+      </w:r>
+      <w:r>
+        <w:rPr>
+          <w:rFonts w:ascii="Times New Roman" w:eastAsia="Times New Roman" w:hAnsi="Times New Roman" w:cs="Times New Roman"/>
+          <w:sz w:val="24"/>
+          <w:szCs w:val="24"/>
+          <w:lang w:eastAsia="en-GB"/>
+        </w:rPr>
+        <w:t>p &gt; 0.05,</w:t>
+      </w:r>
+      <w:r>
+        <w:rPr>
+          <w:rFonts w:ascii="Times New Roman" w:eastAsia="Times New Roman" w:hAnsi="Times New Roman" w:cs="Times New Roman"/>
+          <w:sz w:val="24"/>
+          <w:szCs w:val="24"/>
+          <w:lang w:eastAsia="en-GB"/>
+        </w:rPr>
+        <w:t xml:space="preserve"> với khoảng tin cậy 95% của</w:t>
+      </w:r>
+      <w:r>
+        <w:rPr>
+          <w:rFonts w:ascii="Times New Roman" w:eastAsia="Times New Roman" w:hAnsi="Times New Roman" w:cs="Times New Roman"/>
+          <w:sz w:val="24"/>
+          <w:szCs w:val="24"/>
+          <w:lang w:eastAsia="en-GB"/>
+        </w:rPr>
+        <w:t xml:space="preserve"> Độ lệch (</w:t>
+      </w:r>
+      <w:r>
+        <w:rPr>
+          <w:rFonts w:ascii="Times New Roman" w:eastAsia="Times New Roman" w:hAnsi="Times New Roman" w:cs="Times New Roman"/>
+          <w:sz w:val="24"/>
+          <w:szCs w:val="24"/>
+          <w:lang w:eastAsia="en-GB"/>
+        </w:rPr>
+        <w:t>Bias</w:t>
+      </w:r>
+      <w:r>
+        <w:rPr>
+          <w:rFonts w:ascii="Times New Roman" w:eastAsia="Times New Roman" w:hAnsi="Times New Roman" w:cs="Times New Roman"/>
+          <w:sz w:val="24"/>
+          <w:szCs w:val="24"/>
+          <w:lang w:eastAsia="en-GB"/>
+        </w:rPr>
+        <w:t>) có</w:t>
+      </w:r>
+      <w:r>
+        <w:rPr>
+          <w:rFonts w:ascii="Times New Roman" w:eastAsia="Times New Roman" w:hAnsi="Times New Roman" w:cs="Times New Roman"/>
+          <w:sz w:val="24"/>
+          <w:szCs w:val="24"/>
+          <w:lang w:eastAsia="en-GB"/>
+        </w:rPr>
+        <w:t xml:space="preserve"> chứa hoặc bằng</w:t>
+      </w:r>
+      <w:r>
+        <w:rPr>
+          <w:rFonts w:ascii="Times New Roman" w:eastAsia="Times New Roman" w:hAnsi="Times New Roman" w:cs="Times New Roman"/>
+          <w:sz w:val="24"/>
+          <w:szCs w:val="24"/>
+          <w:lang w:eastAsia="en-GB"/>
+        </w:rPr>
+        <w:t xml:space="preserve"> giá trị</w:t>
+      </w:r>
+      <w:r>
+        <w:rPr>
+          <w:rFonts w:ascii="Times New Roman" w:eastAsia="Times New Roman" w:hAnsi="Times New Roman" w:cs="Times New Roman"/>
+          <w:sz w:val="24"/>
+          <w:szCs w:val="24"/>
+          <w:lang w:eastAsia="en-GB"/>
+        </w:rPr>
+        <w:t xml:space="preserve"> 0, cho thấy chênh lệch giữa hai phương pháp là không có ý nghĩa thống kê.</w:t>
+      </w:r>
+    </w:p>
     <w:p/>
     <w:p>
       <w:r>
@@ -1186,6 +1408,14 @@
               </w:rPr>
               <w:t>AST</w:t>
             </w:r>
+            <w:r>
+              <w:rPr>
+                <w:rFonts w:ascii="Calibri" w:eastAsia="Times New Roman" w:hAnsi="Calibri" w:cs="Calibri"/>
+                <w:color w:val="000000"/>
+                <w:lang w:eastAsia="en-GB"/>
+              </w:rPr>
+              <w:t xml:space="preserve"> (U/L)</w:t>
+            </w:r>
           </w:p>
         </w:tc>
         <w:tc>
@@ -1281,7 +1511,7 @@
                 <w:color w:val="FF0000"/>
                 <w:lang w:eastAsia="en-GB"/>
               </w:rPr>
-              <w:t>0.0000</w:t>
+              <w:t>0.000</w:t>
             </w:r>
           </w:p>
         </w:tc>
@@ -1313,6 +1543,14 @@
               </w:rPr>
               <w:t>LDH</w:t>
             </w:r>
+            <w:r>
+              <w:rPr>
+                <w:rFonts w:ascii="Calibri" w:eastAsia="Times New Roman" w:hAnsi="Calibri" w:cs="Calibri"/>
+                <w:color w:val="000000"/>
+                <w:lang w:eastAsia="en-GB"/>
+              </w:rPr>
+              <w:t xml:space="preserve"> (U/L)</w:t>
+            </w:r>
           </w:p>
         </w:tc>
         <w:tc>
@@ -1408,7 +1646,7 @@
                 <w:color w:val="FF0000"/>
                 <w:lang w:eastAsia="en-GB"/>
               </w:rPr>
-              <w:t>0.0031</w:t>
+              <w:t>0.003</w:t>
             </w:r>
           </w:p>
         </w:tc>
@@ -1437,7 +1675,7 @@
                 <w:color w:val="000000"/>
                 <w:lang w:eastAsia="en-GB"/>
               </w:rPr>
-              <w:t>Potassium (K+)</w:t>
+              <w:t>Kali (mmol/L)</w:t>
             </w:r>
           </w:p>
         </w:tc>
@@ -1530,12 +1768,34 @@
                 <w:color w:val="000000"/>
                 <w:lang w:eastAsia="en-GB"/>
               </w:rPr>
-              <w:t>0.6050</w:t>
+              <w:t>0.605</w:t>
             </w:r>
           </w:p>
         </w:tc>
       </w:tr>
     </w:tbl>
+    <w:p>
+      <w:r>
+        <w:t xml:space="preserve">Nhận xét: </w:t>
+      </w:r>
+      <w:r>
+        <w:t>Kết quả kiểm định Paired t-test so sánh các chỉ số hóa sinh giữa Phương pháp A (PPA) và Phương pháp B (PPB) ghi nhận sự khác biệt có ý nghĩa thống kê đối với AST và LDH</w:t>
+      </w:r>
+      <w:r>
+        <w:t xml:space="preserve"> với p lần lượt là 0.000 và 0.003</w:t>
+      </w:r>
+      <w:r>
+        <w:t>, trong khi chỉ số Kali thể hiện sự tương đồng cao giữ</w:t>
+      </w:r>
+      <w:r>
+        <w:t>a hai phương pháp (p=0.605)</w:t>
+      </w:r>
+    </w:p>
+    <w:p>
+      <w:r>
+        <w:br w:type="page"/>
+      </w:r>
+    </w:p>
     <w:p/>
     <w:p>
       <w:r>
@@ -1546,13 +1806,13 @@
         <mc:AlternateContent>
           <mc:Choice Requires="wpg">
             <w:drawing>
-              <wp:anchor distT="0" distB="0" distL="114300" distR="114300" simplePos="0" relativeHeight="251659264" behindDoc="0" locked="0" layoutInCell="1" allowOverlap="1" wp14:anchorId="05390A46" wp14:editId="71AC5C91">
+              <wp:anchor distT="0" distB="0" distL="114300" distR="114300" simplePos="0" relativeHeight="251659264" behindDoc="0" locked="0" layoutInCell="1" allowOverlap="1" wp14:anchorId="05390A46" wp14:editId="35852EB8">
                 <wp:simplePos x="0" y="0"/>
                 <wp:positionH relativeFrom="margin">
-                  <wp:posOffset>232147</wp:posOffset>
+                  <wp:posOffset>-503404</wp:posOffset>
                 </wp:positionH>
                 <wp:positionV relativeFrom="paragraph">
-                  <wp:posOffset>2696</wp:posOffset>
+                  <wp:posOffset>98276</wp:posOffset>
                 </wp:positionV>
                 <wp:extent cx="5592726" cy="4019151"/>
                 <wp:effectExtent l="0" t="0" r="8255" b="635"/>
@@ -1759,7 +2019,7 @@
           </mc:Choice>
           <mc:Fallback>
             <w:pict>
-              <v:group w14:anchorId="61343E54" id="Group 1" o:spid="_x0000_s1026" style="position:absolute;margin-left:18.3pt;margin-top:.2pt;width:440.35pt;height:316.45pt;z-index:251659264;mso-position-horizontal-relative:margin;mso-width-relative:margin;mso-height-relative:margin" coordsize="64198,56140" o:gfxdata="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">
+              <v:group w14:anchorId="65EE1734" id="Group 1" o:spid="_x0000_s1026" style="position:absolute;margin-left:-39.65pt;margin-top:7.75pt;width:440.35pt;height:316.45pt;z-index:251659264;mso-position-horizontal-relative:margin;mso-width-relative:margin;mso-height-relative:margin" coordsize="64198,56140" o:gfxdata="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">
                 <v:shapetype id="_x0000_t75" coordsize="21600,21600" o:spt="75" o:preferrelative="t" path="m@4@5l@4@11@9@11@9@5xe" filled="f" stroked="f">
                   <v:stroke joinstyle="miter"/>
                   <v:formulas>
@@ -1824,42 +2084,60 @@
     <w:p/>
     <w:p>
       <w:r>
-        <w:lastRenderedPageBreak/>
         <w:t xml:space="preserve">Nhận xét: </w:t>
+      </w:r>
+    </w:p>
+    <w:p/>
+    <w:p>
+      <w:r>
+        <w:t xml:space="preserve">1. </w:t>
+      </w:r>
+      <w:r>
+        <w:t xml:space="preserve">Đồ thị khác biệt tỷ lệ: </w:t>
       </w:r>
     </w:p>
     <w:p>
       <w:r>
-        <w:t xml:space="preserve">1. </w:t>
-      </w:r>
-      <w:r>
-        <w:t xml:space="preserve">Đồ thị khác biệt tỷ lệ: </w:t>
+        <w:t xml:space="preserve">Biểu đồ Histogram + Kiểm định </w:t>
+      </w:r>
+      <w:r>
+        <w:t>Phân bố</w:t>
+      </w:r>
+      <w:r>
+        <w:t xml:space="preserve"> </w:t>
+      </w:r>
+      <w:r>
+        <w:t xml:space="preserve"> </w:t>
+      </w:r>
+      <w:r>
+        <w:t>Shapiro-Wilk</w:t>
+      </w:r>
+      <w:r>
+        <w:t xml:space="preserve"> có</w:t>
+      </w:r>
+      <w:r>
+        <w:t xml:space="preserve"> p-value</w:t>
+      </w:r>
+      <w:r>
+        <w:t xml:space="preserve"> &gt; 0.05</w:t>
+      </w:r>
+      <w:r>
+        <w:t xml:space="preserve"> </w:t>
+      </w:r>
+      <w:r>
+        <w:sym w:font="Wingdings" w:char="F0E0"/>
+      </w:r>
+      <w:r>
+        <w:t xml:space="preserve"> phân bố chuẩn trên toàn khoảng nồng độ khảo sát</w:t>
       </w:r>
     </w:p>
     <w:p>
       <w:r>
-        <w:t xml:space="preserve">Biểu đồ Histogram + Kiểm định </w:t>
-      </w:r>
-      <w:r>
-        <w:t xml:space="preserve">Phân bố chuẩn </w:t>
-      </w:r>
-      <w:r>
-        <w:t>Shapiro-Wilk p-value</w:t>
-      </w:r>
-      <w:r>
-        <w:t xml:space="preserve"> &gt; 0.05</w:t>
-      </w:r>
-      <w:r>
-        <w:t xml:space="preserve">, </w:t>
+        <w:t xml:space="preserve">Độ lệch dương/âm, </w:t>
       </w:r>
     </w:p>
     <w:p>
       <w:r>
-        <w:t xml:space="preserve">Độ lệch dương/âm, </w:t>
-      </w:r>
-    </w:p>
-    <w:p>
-      <w:r>
         <w:t xml:space="preserve">Khoảng 95% CI có chứa giá trị 0 </w:t>
       </w:r>
       <w:r>
@@ -1868,8 +2146,6 @@
       <w:r>
         <w:t xml:space="preserve"> lệch không đổi</w:t>
       </w:r>
-      <w:bookmarkStart w:id="0" w:name="_GoBack"/>
-      <w:bookmarkEnd w:id="0"/>
     </w:p>
     <w:p>
       <w:r>
@@ -2442,6 +2718,15 @@
               </w:rPr>
               <w:t xml:space="preserve"> nồng độ</w:t>
             </w:r>
+            <w:r>
+              <w:rPr>
+                <w:rFonts w:ascii="Calibri" w:eastAsia="Times New Roman" w:hAnsi="Calibri" w:cs="Calibri"/>
+                <w:b/>
+                <w:color w:val="000000"/>
+                <w:lang w:eastAsia="en-GB"/>
+              </w:rPr>
+              <w:t xml:space="preserve"> khảo sát</w:t>
+            </w:r>
           </w:p>
         </w:tc>
       </w:tr>
@@ -5395,6 +5680,38 @@
         </w:tc>
       </w:tr>
     </w:tbl>
+    <w:p>
+      <w:r>
+        <w:t>Nhận xét:</w:t>
+      </w:r>
+    </w:p>
+    <w:p/>
+    <w:p/>
+    <w:p>
+      <w:pPr>
+        <w:rPr>
+          <w:b/>
+        </w:rPr>
+      </w:pPr>
+      <w:r>
+        <w:rPr>
+          <w:b/>
+        </w:rPr>
+        <w:t>II</w:t>
+      </w:r>
+      <w:r>
+        <w:rPr>
+          <w:b/>
+        </w:rPr>
+        <w:t>I</w:t>
+      </w:r>
+      <w:r>
+        <w:rPr>
+          <w:b/>
+        </w:rPr>
+        <w:t>. BÀN LUẬN</w:t>
+      </w:r>
+    </w:p>
     <w:p/>
     <w:sectPr>
       <w:headerReference w:type="default" r:id="rId18"/>
@@ -5963,6 +6280,11 @@
     <w:uiPriority w:val="99"/>
     <w:rsid w:val="00253E9E"/>
   </w:style>
+  <w:style w:type="character" w:customStyle="1" w:styleId="math-inline">
+    <w:name w:val="math-inline"/>
+    <w:basedOn w:val="DefaultParagraphFont"/>
+    <w:rsid w:val="00A1659F"/>
+  </w:style>
 </w:styles>
 </file>
 

</xml_diff>